<commit_message>
Lavs improved in Phase 12
</commit_message>
<xml_diff>
--- a/fixtures/scripts/endurance-full-cleaned.docx
+++ b/fixtures/scripts/endurance-full-cleaned.docx
@@ -8263,6 +8263,14 @@
         <w:rPr>
           <w:rtl w:val="0"/>
         </w:rPr>
+      </w:r>
+    </w:p>
+    <w:p>
+      <w:pPr>
+        <w:pStyle w:val="Heading4"/>
+      </w:pPr>
+      <w:r>
+        <w:t>QUEEN</w:t>
       </w:r>
     </w:p>
     <w:p>

</xml_diff>